<commit_message>
ultima version (si dios quiere)
</commit_message>
<xml_diff>
--- a/Informes/docx/Articulo_Catedra_Parques_Solares.docx
+++ b/Informes/docx/Articulo_Catedra_Parques_Solares.docx
@@ -47,7 +47,7 @@
           <w:i/>
           <w:sz w:val="24"/>
         </w:rPr>
-        <w:t>Universidad Tecnológica Nacional Facultad Regional Buenos Aires</w:t>
+        <w:t>Universidad Tecnológica Nacional</w:t>
       </w:r>
     </w:p>
     <w:p>
@@ -89,7 +89,7 @@
           <w:i/>
           <w:sz w:val="20"/>
         </w:rPr>
-        <w:t>La preselección de parques solares exige construir configuraciones territoriales continuas y comparar criterios que pueden entrar en conflicto. El objetivo fue evaluar si un algoritmo genético con representación espacial puede generar alternativas contiguas, diversas y reproducibles para Santa Fe. La corrida run-20260928T134148-b01f2d3a utilizó una grilla de 500 m, exclusión urbana previa, cuatro componentes de aptitud y un límite experimental de 80 MW. Se analizaron 535,751 celdas, de las cuales 485,804 quedaron disponibles. El mejor parque reunió 10 celdas, 250 ha y 78,25 MW, con fitness 0,7183. La población final conservó 50 configuraciones distintas entre 50 individuos y permitió obtener cinco alternativas territoriales sin superposición. El método resulta útil como preselección y como instrumento de investigación, pero no demuestra óptimo global, capacidad eléctrica disponible ni viabilidad predial, ambiental o económica.</w:t>
+        <w:t>La preselección de parques solares exige construir configuraciones territoriales continuas y comparar criterios que pueden entrar en conflicto. El objetivo fue evaluar si un algoritmo genético con representación espacial puede generar alternativas contiguas, diversas y reproducibles para Santa Fe. La corrida run-20261007T021047-df88ea4d utilizó una grilla de 500 m, exclusión urbana previa, cinco componentes de aptitud y un límite experimental de 80 MW. Se analizaron 535,751 celdas, de las cuales 526,194 quedaron disponibles. El mejor parque reunió 9 celdas, 225,00 ha y 70,425 MW, con fitness 0,7283. La población final conservó 50 configuraciones distintas entre 50 individuos y permitió obtener cinco alternativas territoriales sin superposición. El método resulta útil como preselección y como instrumento de investigación, pero no demuestra óptimo global, capacidad eléctrica disponible ni viabilidad predial, ambiental o económica.</w:t>
       </w:r>
     </w:p>
     <w:p>
@@ -201,7 +201,7 @@
           <w:i w:val="0"/>
           <w:sz w:val="24"/>
         </w:rPr>
-        <w:t>Pregunta principal. ¿En qué medida un algoritmo genético con representación espacial puede producir, de forma reproducible, configuraciones contiguas y diversas de parques solares para Santa Fe, ordenadas por radiación, proximidad a infraestructura y potencia instalada, y qué límites condicionan el uso territorial de ese ranking?</w:t>
+        <w:t>Pregunta principal. ¿En qué medida un algoritmo genético con representación espacial puede producir, de forma reproducible, configuraciones contiguas y diversas de parques solares para Santa Fe, ordenadas por radiación, proximidad a infraestructura, potencia instalada y compactación, y qué límites condicionan el uso territorial de ese ranking?</w:t>
       </w:r>
     </w:p>
     <w:p>
@@ -233,7 +233,7 @@
           <w:i w:val="0"/>
           <w:sz w:val="24"/>
         </w:rPr>
-        <w:t>Objetivos específicos: representar cada alternativa como un parque formado por celdas contiguas; integrar radiación, distancias a líneas y transformadores, potencia y exclusión urbana; mantener diversidad durante la búsqueda; producir rankings general y territorial; medir convergencia y repetibilidad; auditar trazabilidad de datos y parámetros; e identificar la información faltante antes de cualquier decisión de emplazamiento.</w:t>
+        <w:t>Objetivos específicos: representar cada alternativa como un parque formado por celdas contiguas; integrar radiación, distancias a líneas y transformadores, potencia, compactación y exclusión urbana; mantener diversidad durante la búsqueda; producir rankings general y territorial; medir convergencia y repetibilidad; auditar trazabilidad de datos y parámetros; e identificar la información faltante antes de cualquier decisión de emplazamiento.</w:t>
       </w:r>
     </w:p>
     <w:p>
@@ -265,7 +265,7 @@
           <w:i w:val="0"/>
           <w:sz w:val="24"/>
         </w:rPr>
-        <w:t>Hipótesis de trabajo actualizada. Si las alternativas se representan como conjuntos contiguos de celdas de 500 m y la búsqueda incorpora inicialización territorial, control de duplicados y mutaciones que alteran efectivamente el fenotipo, entonces el algoritmo genético puede explorar de forma reproducible configuraciones factibles bajo el modelo, conservar diversidad poblacional y producir tanto un ranking de máxima aptitud como una selección territorial sin superposición.</w:t>
+        <w:t>Hipótesis de trabajo. Si las alternativas se representan como conjuntos contiguos de celdas de 500 m y la búsqueda incorpora inicialización territorial, control de duplicados y mutaciones que alteran efectivamente el fenotipo, entonces el algoritmo genético puede explorar de forma reproducible configuraciones factibles bajo el modelo, conservar diversidad poblacional y producir tanto un ranking de máxima aptitud como una selección territorial sin superposición.</w:t>
       </w:r>
     </w:p>
     <w:p>
@@ -281,7 +281,7 @@
           <w:i w:val="0"/>
           <w:sz w:val="24"/>
         </w:rPr>
-        <w:t>La hipótesis se evalúa en una corrida sobre Santa Fe con cuatro componentes de aptitud: radiación 0.40, proximidad a líneas 0.10, proximidad a transformadores 0.40 y potencia instalada 0.10. El crecimiento se limita por una capacidad experimental de 80 MW y una densidad de 31.3 MW/km². No se fija una superficie nominal de dos hectáreas: el área resulta de las celdas aceptadas hasta el límite de potencia.</w:t>
+        <w:t>La hipótesis se evalúa en una corrida sobre Santa Fe con cinco componentes de aptitud: radiación 0.35, proximidad a líneas 0.10, proximidad a transformadores 0.35 potencia instalada 0.10 y compactación 0.10. El crecimiento se limita por una capacidad experimental de 80 MW y una densidad de 31.3 MW/km². El área resulta de las celdas aceptadas hasta el límite de potencia.</w:t>
       </w:r>
     </w:p>
     <w:p>
@@ -329,7 +329,7 @@
           <w:i w:val="0"/>
           <w:sz w:val="24"/>
         </w:rPr>
-        <w:t>Criterios. La irradiación del parque es un promedio ponderado por área. Las distancias se calculan desde los centroides de sus celdas a las geometrías de líneas y a las cuatro estaciones transformadoras incluidas —Santo Tomé, Cañada de Gómez, Rosario Oeste y Romang—. La potencia surge del área por una densidad experimental. Todos los componentes se normalizan antes de la suma ponderada.</w:t>
+        <w:t>Criterios. La irradiación del parque es un promedio ponderado por área. Las distancias se calculan desde el centroide ponderado por área del parque a las geometrías de líneas y a las cuatro estaciones transformadoras incluidas —Santo Tomé, Río Coronda, Rosario Oeste y Romang—. La potencia surge del área por una densidad experimental. La forma se valora con 4πA/P². Irradiación y distancias usan min-max fijo, potencia usa P/Pmáx y compactación ya está en [0,1]. Los cinco componentes forman una suma ponderada.</w:t>
       </w:r>
     </w:p>
     <w:p>
@@ -345,7 +345,7 @@
           <w:i w:val="0"/>
           <w:sz w:val="24"/>
         </w:rPr>
-        <w:t>Restricción urbana. Se usan puntos BAHRA de tipo LOCALIDAD con un buffer uniforme de 3 km, aplicado antes de la búsqueda. Es una aproximación conservadora y no equivale a límites urbanos catastrales.</w:t>
+        <w:t>Restricción urbana. Se usan envolventes INDEC del Censo 2022, con un margen de 0 km desde el perímetro. Se excluyen también los huecos interiores encerrados. Toda celda que intersecta la máscara queda excluida antes de la búsqueda. La máscara final se recorta a Santa Fe. La cartografía censal no acredita límites catastrales ni actualización posterior a 2022.</w:t>
       </w:r>
     </w:p>
     <w:p>
@@ -377,7 +377,7 @@
           <w:i w:val="0"/>
           <w:sz w:val="24"/>
         </w:rPr>
-        <w:t>La corrida run-20260928T134148-b01f2d3a utilizó semilla 42, población 50, 200 generaciones, cruce 0.75, mutación 0.20, elitismo 2 y torneo 3. La inicialización territorial empleó sectores de 50 km; el archivo conservó hasta 10 soluciones por territorio y produjo 800 candidatos únicos para el ranking territorial.</w:t>
+        <w:t>La corrida run-20261007T021047-df88ea4d utilizó semilla 20261007, población 50, 200 generaciones, cruce 0.75, mutación 0.20, elitismo 2 y torneo 3. La inicialización territorial empleó sectores de 50 km; el archivo conservó hasta 10 soluciones por territorio y produjo 800 candidatos únicos para el ranking territorial.</w:t>
       </w:r>
     </w:p>
     <w:p>
@@ -393,7 +393,7 @@
           <w:i w:val="0"/>
           <w:sz w:val="24"/>
         </w:rPr>
-        <w:t>La evaluación usa una caché por genotipo y un registro histórico por fenotipo. El control de duplicados intenta reemplazar individuos repetidos y la mutación dispone de varios intentos para generar un cambio observable. Estos mecanismos responden al problema detectado en la versión previa, donde la población podía converger a pocas geometrías repetidas.</w:t>
+        <w:t>La evaluación usa una caché por genotipo y un registro histórico por fenotipo. El control de duplicados intenta reemplazar individuos repetidos y la mutación dispone de varios intentos para generar un cambio observable. Estos mecanismos sostienen la exploración y permiten registrar cambios territoriales efectivos.</w:t>
       </w:r>
     </w:p>
     <w:p>
@@ -441,7 +441,7 @@
           <w:i w:val="0"/>
           <w:sz w:val="24"/>
         </w:rPr>
-        <w:t>Preprocesamiento. Se generaron 535,751 celdas; 49,947 (9,3 %) quedaron excluidas por intersección urbana y 485,804 permanecieron válidas. La cobertura climática registrada es “100% unique finite hourly values”.</w:t>
+        <w:t>Preprocesamiento. Se generaron 535,751 celdas; 9,557 (1,8 %) quedaron excluidas por intersección urbana y 526,194 permanecieron válidas. La cobertura climática registrada es “100% unique finite hourly values”.</w:t>
       </w:r>
     </w:p>
     <w:p>
@@ -457,7 +457,7 @@
           <w:i w:val="0"/>
           <w:sz w:val="24"/>
         </w:rPr>
-        <w:t>Búsqueda. El mejor fitness observado fue 0,7183. El parque correspondiente tiene 10 celdas, 2,50 km², 78,25 MW y utiliza 97,8 % del límite experimental. Su irradiación estimada es 1.896,0 kWh/m²/año y su energía anual ideal de referencia es 148.359 MWh; esta última no incluye pérdidas ni modelado DC/AC.</w:t>
+        <w:t>Búsqueda. El mejor fitness observado fue 0,7283. El parque correspondiente tiene 9 celdas, 2,25 km², 70,42 MW y utiliza 88,0 % del límite experimental. Su irradiación estimada es 1.896,0 kWh/m²/año y su energía anual ideal de referencia es 133.523 MWh; esta última no incluye pérdidas ni modelado DC/AC.</w:t>
       </w:r>
     </w:p>
     <w:p>
@@ -535,14 +535,15 @@
         <w:tblStyle w:val="TableGrid"/>
         <w:tblW w:type="auto" w:w="0"/>
         <w:jc w:val="center"/>
+        <w:tblLayout w:type="fixed"/>
         <w:tblLook w:firstColumn="1" w:firstRow="1" w:lastColumn="0" w:lastRow="0" w:noHBand="0" w:noVBand="1" w:val="04A0"/>
       </w:tblPr>
       <w:tblGrid>
-        <w:gridCol w:w="1814"/>
-        <w:gridCol w:w="1814"/>
-        <w:gridCol w:w="1814"/>
-        <w:gridCol w:w="1814"/>
-        <w:gridCol w:w="1814"/>
+        <w:gridCol w:w="624"/>
+        <w:gridCol w:w="567"/>
+        <w:gridCol w:w="907"/>
+        <w:gridCol w:w="794"/>
+        <w:gridCol w:w="850"/>
       </w:tblGrid>
       <w:tr>
         <w:trPr>
@@ -723,7 +724,7 @@
                 <w:b w:val="0"/>
                 <w:sz w:val="16"/>
               </w:rPr>
-              <w:t>0.07</w:t>
+              <w:t>0.10</w:t>
             </w:r>
           </w:p>
         </w:tc>
@@ -744,7 +745,7 @@
                 <w:b w:val="0"/>
                 <w:sz w:val="16"/>
               </w:rPr>
-              <w:t>174.42</w:t>
+              <w:t>169.87</w:t>
             </w:r>
           </w:p>
         </w:tc>
@@ -765,7 +766,7 @@
                 <w:b w:val="0"/>
                 <w:sz w:val="16"/>
               </w:rPr>
-              <w:t>0.7183</w:t>
+              <w:t>0.7283</w:t>
             </w:r>
           </w:p>
         </w:tc>
@@ -833,7 +834,7 @@
                 <w:b w:val="0"/>
                 <w:sz w:val="16"/>
               </w:rPr>
-              <w:t>0.09</w:t>
+              <w:t>0.08</w:t>
             </w:r>
           </w:p>
         </w:tc>
@@ -854,7 +855,7 @@
                 <w:b w:val="0"/>
                 <w:sz w:val="16"/>
               </w:rPr>
-              <w:t>6.49</w:t>
+              <w:t>11.78</w:t>
             </w:r>
           </w:p>
         </w:tc>
@@ -875,7 +876,7 @@
                 <w:b w:val="0"/>
                 <w:sz w:val="16"/>
               </w:rPr>
-              <w:t>0.6824</w:t>
+              <w:t>0.6957</w:t>
             </w:r>
           </w:p>
         </w:tc>
@@ -922,7 +923,7 @@
                 <w:b w:val="0"/>
                 <w:sz w:val="16"/>
               </w:rPr>
-              <w:t>RM</w:t>
+              <w:t>RO</w:t>
             </w:r>
           </w:p>
         </w:tc>
@@ -943,7 +944,7 @@
                 <w:b w:val="0"/>
                 <w:sz w:val="16"/>
               </w:rPr>
-              <w:t>1.16</w:t>
+              <w:t>0.22</w:t>
             </w:r>
           </w:p>
         </w:tc>
@@ -964,7 +965,7 @@
                 <w:b w:val="0"/>
                 <w:sz w:val="16"/>
               </w:rPr>
-              <w:t>4.55</w:t>
+              <w:t>8.98</w:t>
             </w:r>
           </w:p>
         </w:tc>
@@ -985,7 +986,7 @@
                 <w:b w:val="0"/>
                 <w:sz w:val="16"/>
               </w:rPr>
-              <w:t>0.6823</w:t>
+              <w:t>0.6953</w:t>
             </w:r>
           </w:p>
         </w:tc>
@@ -1032,7 +1033,7 @@
                 <w:b w:val="0"/>
                 <w:sz w:val="16"/>
               </w:rPr>
-              <w:t>RM</w:t>
+              <w:t>RO</w:t>
             </w:r>
           </w:p>
         </w:tc>
@@ -1053,7 +1054,7 @@
                 <w:b w:val="0"/>
                 <w:sz w:val="16"/>
               </w:rPr>
-              <w:t>0.81</w:t>
+              <w:t>0.02</w:t>
             </w:r>
           </w:p>
         </w:tc>
@@ -1074,7 +1075,7 @@
                 <w:b w:val="0"/>
                 <w:sz w:val="16"/>
               </w:rPr>
-              <w:t>2.50</w:t>
+              <w:t>15.96</w:t>
             </w:r>
           </w:p>
         </w:tc>
@@ -1095,7 +1096,7 @@
                 <w:b w:val="0"/>
                 <w:sz w:val="16"/>
               </w:rPr>
-              <w:t>0.6810</w:t>
+              <w:t>0.6910</w:t>
             </w:r>
           </w:p>
         </w:tc>
@@ -1138,7 +1139,7 @@
                 <w:b w:val="0"/>
                 <w:sz w:val="16"/>
               </w:rPr>
-              <w:t>RM</w:t>
+              <w:t>RO</w:t>
             </w:r>
           </w:p>
         </w:tc>
@@ -1157,7 +1158,7 @@
                 <w:b w:val="0"/>
                 <w:sz w:val="16"/>
               </w:rPr>
-              <w:t>0.92</w:t>
+              <w:t>0.22</w:t>
             </w:r>
           </w:p>
         </w:tc>
@@ -1176,7 +1177,7 @@
                 <w:b w:val="0"/>
                 <w:sz w:val="16"/>
               </w:rPr>
-              <w:t>5.99</w:t>
+              <w:t>14.69</w:t>
             </w:r>
           </w:p>
         </w:tc>
@@ -1195,7 +1196,7 @@
                 <w:b w:val="0"/>
                 <w:sz w:val="16"/>
               </w:rPr>
-              <w:t>0.6805</w:t>
+              <w:t>0.6885</w:t>
             </w:r>
           </w:p>
         </w:tc>
@@ -1246,7 +1247,7 @@
           <w:i w:val="0"/>
           <w:sz w:val="24"/>
         </w:rPr>
-        <w:t>La evidencia apoya la parte operativa de la hipótesis: la representación produce parques contiguos, la corrida es reproducible con la semilla y los parámetros registrados, la población final mantiene diversidad completa y se obtienen cinco alternativas territoriales no superpuestas. Esto corrige el foco de la versión anterior, que trataba cada celda como una solución y medía éxito por coincidencia con un ranking exhaustivo de celdas.</w:t>
+        <w:t>La evidencia apoya la parte operativa de la hipótesis: la representación produce parques contiguos, la corrida es reproducible con la semilla y los parámetros registrados, la población final mantiene diversidad completa y se obtienen cinco alternativas territoriales no superpuestas. El objeto de evaluación es el parque completo construido por cada cromosoma.</w:t>
       </w:r>
     </w:p>
     <w:p>
@@ -1262,7 +1263,7 @@
           <w:i w:val="0"/>
           <w:sz w:val="24"/>
         </w:rPr>
-        <w:t>La evidencia no demuestra óptimo global. Una auditoría de una corrida anterior encontró configuraciones rectangulares mejores bajo sus propios pesos; el algoritmo vigente mejoró diversidad y exploración en pruebas de referencia, pero la naturaleza combinatoria impide convertir esa mejora en garantía de optimalidad. Los resultados actuales, con pesos distintos, no deben compararse numéricamente de forma directa con aquella corrida.</w:t>
+        <w:t>La evidencia no demuestra óptimo global. El experimento documentado en docs/validacion-busqueda.md compara el AG con azar y azar con búsqueda local, usando el mismo dataset y los cinco pesos actuales. El AG ganó 10 de 10 comparaciones frente al azar y 8 de 10 frente a azar con mejora local. La enumeración de rectángulos resuelve esa familia de formas, no el dominio completo.</w:t>
       </w:r>
     </w:p>
     <w:p>
@@ -1278,7 +1279,7 @@
           <w:i w:val="0"/>
           <w:sz w:val="24"/>
         </w:rPr>
-        <w:t>Los pesos favorecen por igual radiación y cercanía a transformadores (0,40 cada uno). Son supuestos de investigación y no una preferencia validada por especialistas. El primer puesto general obtiene radiación máxima, pero queda aproximadamente a 174 km de Santo Tomé, la estación más cercana entre solo cuatro registros incluidos. Esa distancia revela el compromiso elegido por la función, no una recomendación de conexión.</w:t>
+        <w:t>Los pesos favorecen por igual radiación y cercanía a transformadores (0,35 cada uno), y asignan 0,10 a líneas, potencia y compactación. Son supuestos de investigación y no una preferencia validada por especialistas. Las distancias del ranking corresponden únicamente a cuatro estaciones consideradas. El compromiso elegido por la función no constituye una recomendación de conexión.</w:t>
       </w:r>
     </w:p>
     <w:p>
@@ -1326,7 +1327,7 @@
           <w:i w:val="0"/>
           <w:sz w:val="24"/>
         </w:rPr>
-        <w:t>El proyecto aborda ahora el problema correcto: no busca una celda aislada, sino configuraciones contiguas de superficie variable que aproximan el tamaño de una planta dentro de un límite experimental de potencia. La grilla de 500 m permite construir geometrías explícitas y el algoritmo ofrece una forma trazable de recorrer un espacio combinatorio muy grande.</w:t>
+        <w:t>El proyecto busca configuraciones contiguas de superficie variable que aproximan el tamaño de una planta dentro de un límite experimental de potencia. La grilla de 500 m permite construir geometrías explícitas y el algoritmo ofrece una forma trazable de recorrer un espacio combinatorio muy grande.</w:t>
       </w:r>
     </w:p>
     <w:p>
@@ -1534,7 +1535,7 @@
           <w:i w:val="0"/>
           <w:sz w:val="20"/>
         </w:rPr>
-        <w:t>[10] Jefatura de Gabinete de Ministros, Localidades BAHRA. Datos Argentina. https://datos.gob.ar/dataset/jgm-servicio-normalizacion-datos-geograficos/archivo/jgm_8.21</w:t>
+        <w:t>[10] Instituto Nacional de Estadística y Censos (2022), Marco Geoestadístico Nacional: Localidades censales. https://portalgeoestadistico.indec.gob.ar/geoportal/documents/metadato_localidades_censales.pdf</w:t>
       </w:r>
     </w:p>
     <w:p>
@@ -1567,6 +1568,22 @@
           <w:sz w:val="20"/>
         </w:rPr>
         <w:t>[12] Secretaría de Energía, Transporte Eléctrico AT — Estaciones Transformadoras. Datos Argentina. https://www.datos.gob.ar/dataset/energia-transporte-electrico-at-estaciones-transformadoras</w:t>
+      </w:r>
+    </w:p>
+    <w:p>
+      <w:pPr>
+        <w:spacing w:after="40" w:line="240" w:lineRule="auto"/>
+        <w:jc w:val="left"/>
+        <w:keepLines/>
+      </w:pPr>
+      <w:r>
+        <w:rPr>
+          <w:rFonts w:ascii="Times New Roman" w:hAnsi="Times New Roman"/>
+          <w:b w:val="0"/>
+          <w:i w:val="0"/>
+          <w:sz w:val="20"/>
+        </w:rPr>
+        <w:t>[13] S. Ong et al., Land-Use Requirements for Solar Power Plants in the United States. NREL, 2013, tabla ES-1: 7,9 acres/MWac de área total para fotovoltaica grande. https://docs.nrel.gov/docs/fy13osti/56290.pdf</w:t>
       </w:r>
     </w:p>
     <w:sectPr>

</xml_diff>